<commit_message>
Add frozen governance E2E run; fix stale reporting tests; clarify segment universes
- tests/phase6/integration/test_governance_e2e.py: six governance-critical
  scenarios against the live extractor (ollama qwen2.5:7b), synthetic inputs,
  real API/DB/validation/gate/adequacy/analytics/deterministic reporter.
- scripts/run_governance_e2e.py: refuses a dirty tree, pins commit and model
  digest, writes docs/paper/governance_e2e_run.json.
- test_reporting_provenance_e2e.py: two tests exercised the generative
  reporter without requesting it; default became deterministic in 63a73a6.
- make_manuscript.py: state the 9,018 / 2,442 / 3,371 / 2,051 segment
  universes and the per-child caps behind them.

Co-Authored-By: Claude Opus 5.5 <noreply@anthropic.com>
</commit_message>
<xml_diff>
--- a/docs/paper/Manuscript_Working_Draft.docx
+++ b/docs/paper/Manuscript_Working_Draft.docx
@@ -25,7 +25,7 @@
         <w:rPr>
           <w:i w:val="0"/>
         </w:rPr>
-        <w:t>Generated from 56 recorded artefacts; every figure in this document is derived from data in this repository and no number is typed by hand.</w:t>
+        <w:t>Generated from 61 recorded artefacts; every figure in this document is derived from data in this repository and no number is typed by hand.</w:t>
       </w:r>
     </w:p>
     <w:p>
@@ -195,7 +195,7 @@
         <w:rPr>
           <w:i w:val="0"/>
         </w:rPr>
-        <w:t>Behavioural segments were derived from the Rollins (child-investigator) and Flusberg (child-parent) ASDBank CHAT corpora: 11 children, 85 sessions, 75,003 utterances. After parsing, de-identification and episode segmentation, 2,442 behavioural segments were available, 162 to 273 per child.</w:t>
+        <w:t>Behavioural segments were derived from the Rollins (child-investigator) and Flusberg (child-parent) ASDBank CHAT corpora: 11 children, 85 sessions, 75,003 utterances. Parsing, de-identification and episode segmentation produced 9,018 episodes. A child- and episode-type-balanced selection capped at 273 per child yielded 2,442 behavioural segments (162 to 273 per child), from which the annotation pool was drawn.</w:t>
       </w:r>
     </w:p>
     <w:p>
@@ -415,7 +415,7 @@
         <w:rPr>
           <w:i w:val="0"/>
         </w:rPr>
-        <w:t>The exclusion rule is deliberately stricter than removing the 330 annotated segments. The entire original stratified pool of 1,320 is excluded, because batch construction consumed 506 pool segments to retain 330 and no record survives of which 176 were rejected. Sampling the pool remainder would therefore have enriched the set with segments a generator had already failed on — conditioning in the opposite direction, and harder to argue away than the original. The held-out set is drawn from the 2,051 segments outside the pool entirely.</w:t>
+        <w:t>The exclusion rule is deliberately stricter than removing the 330 annotated segments. The entire original stratified pool of 1,320 is excluded, because batch construction consumed 506 pool segments to retain 330 and no record survives of which 176 were rejected. Sampling the pool remainder would therefore have enriched the set with segments a generator had already failed on — conditioning in the opposite direction, and harder to argue away than the original. The held-out set is drawn from the same balanced selection with a higher cap of 455 per child, which yields 3,371 segments; excluding the entire 1,320-segment pool leaves 2,051 eligible segments. Of the 132 held-out segments, 81 fall inside the 2,442-segment selection and 51 outside it.</w:t>
       </w:r>
     </w:p>
     <w:p>
@@ -7730,7 +7730,7 @@
         <w:rPr>
           <w:i w:val="0"/>
         </w:rPr>
-        <w:t>All results derive from 56 recorded artefacts, of which 38 are pinned by SHA-256 checksum. The reproduction sequence is recorded in docs/paper/artifacts.md. Tests re-derive every number in the manuscript from its artefact and fail if prose and data disagree. Fixed seeds: sheet ordering 42 and 4242, bootstrap 20260915/20260916 at 10,000 replicates.</w:t>
+        <w:t>All results derive from 61 recorded artefacts, of which 38 are pinned by SHA-256 checksum. The reproduction sequence is recorded in docs/paper/artifacts.md. Tests re-derive every number in the manuscript from its artefact and fail if prose and data disagree. Fixed seeds: sheet ordering 42 and 4242, bootstrap 20260915/20260916 at 10,000 replicates.</w:t>
       </w:r>
     </w:p>
     <w:p>

</xml_diff>